<commit_message>
update and reposition resume, add target job titles to apply for
</commit_message>
<xml_diff>
--- a/resumes/Myers_2025-1-9.docx
+++ b/resumes/Myers_2025-1-9.docx
@@ -15,7 +15,10 @@
         <w:pStyle w:val="ResumeTitleRole"/>
       </w:pPr>
       <w:r>
-        <w:t>Sr. Programmer/Analyst</w:t>
+        <w:rPr>
+          <w:b/>
+        </w:rPr>
+        <w:t>Full-Stack Software Engineer</w:t>
       </w:r>
     </w:p>
     <w:p>
@@ -23,37 +26,7 @@
         <w:pStyle w:val="ResumeBodyTextExperience"/>
       </w:pPr>
       <w:r>
-        <w:t xml:space="preserve">Nick is an accomplished </w:t>
-      </w:r>
-      <w:r>
-        <w:t xml:space="preserve">full stack developer </w:t>
-      </w:r>
-      <w:r>
-        <w:t xml:space="preserve">with experience in a broad range of technologies, including React, Java Spring, .NET, and cloud platforms like Heroku. He specializes in building robust, user-friendly front-end interfaces and scalable back-end solutions, leveraging his skills in frameworks such as Redux, SQL, and Python. With over three years of development experience across </w:t>
-      </w:r>
-      <w:r>
-        <w:t xml:space="preserve">several </w:t>
-      </w:r>
-      <w:r>
-        <w:t xml:space="preserve">industries, </w:t>
-      </w:r>
-      <w:r>
-        <w:t>he</w:t>
-      </w:r>
-      <w:r>
-        <w:t xml:space="preserve"> has contributed to complex projects, including SaaS implementations, data migrations, and custom web applications. His expertise in agile methodologies, API creation, and continuous integration ensures he consistently delivers high-quality solutions tailored to client needs</w:t>
-      </w:r>
-      <w:r>
-        <w:rPr>
-          <w:rFonts w:ascii="Arial" w:hAnsi="Arial" w:cs="Arial"/>
-        </w:rPr>
-        <w:t>​</w:t>
-      </w:r>
-      <w:r>
-        <w:rPr>
-          <w:rFonts w:ascii="Arial" w:hAnsi="Arial" w:cs="Arial"/>
-        </w:rPr>
-        <w:t>.</w:t>
+        <w:t>Full-stack software engineer with five years delivering client web applications, APIs, integrations, and data migrations in consulting. Titles progressed from Programmer/Analyst to Software Engineer while owning features across React/TypeScript and .NET.</w:t>
       </w:r>
     </w:p>
     <w:p>
@@ -106,319 +79,192 @@
     </w:p>
     <w:p>
       <w:pPr>
-        <w:pStyle w:val="BodyText"/>
+        <w:pStyle w:val="ResumeHeading3"/>
       </w:pPr>
       <w:r>
         <w:rPr>
           <w:b/>
-          <w:bCs/>
         </w:rPr>
-        <w:t>Sr.</w:t>
-      </w:r>
+        <w:t>Resource Data, Inc.</w:t>
+      </w:r>
+      <w:r>
+        <w:t xml:space="preserve"> — Programmer/Analyst → Senior Programmer/Analyst → Software Engineer</w:t>
+      </w:r>
+    </w:p>
+    <w:p>
+      <w:pPr>
+        <w:pStyle w:val="ResumeHeading3"/>
+      </w:pPr>
+      <w:r>
+        <w:t>May 2021 – May 2026 · IT consulting / full-stack client delivery</w:t>
+      </w:r>
+    </w:p>
+    <w:p>
+      <w:pPr>
+        <w:pStyle w:val="ResumeHeading3"/>
+      </w:pPr>
+      <w:r>
+        <w:rPr>
+          <w:i/>
+        </w:rPr>
+        <w:t>(Jan. 2024 – Sept. 2024)</w:t>
+      </w:r>
+      <w:r>
+        <w:br/>
+      </w:r>
+      <w:r>
+        <w:t>Provided dotCMS support for CUI Inc. Designed and implemented backend solutions to improve content management functionality and user experience.</w:t>
+      </w:r>
+    </w:p>
+    <w:p>
+      <w:pPr>
+        <w:pStyle w:val="ResumeHeading3"/>
+      </w:pPr>
+      <w:r>
+        <w:rPr>
+          <w:i/>
+        </w:rPr>
+        <w:t>(Nov. 2023 – Aug. 2024)</w:t>
+      </w:r>
+      <w:r>
+        <w:br/>
+      </w:r>
+      <w:r>
+        <w:t>Enhanced Career Launch and site improvements for the Washington Student Achievement Council. Collaborated with team members to support ongoing development and maintenance of the website.</w:t>
+      </w:r>
+    </w:p>
+    <w:p>
+      <w:pPr>
+        <w:pStyle w:val="ResumeHeading3"/>
+      </w:pPr>
+      <w:r>
+        <w:rPr>
+          <w:i/>
+        </w:rPr>
+        <w:t>(Dec. 2023 – May 2024)</w:t>
+      </w:r>
+      <w:r>
+        <w:br/>
+      </w:r>
+      <w:r>
+        <w:t>Developed custom PDFs for IdeaRoom Technologies on its American Steel project. Built components with React, TypeScript, and Storybook to streamline the client’s custom order process.</w:t>
+      </w:r>
+    </w:p>
+    <w:p>
+      <w:pPr>
+        <w:pStyle w:val="ResumeHeading3"/>
+      </w:pPr>
+      <w:r>
+        <w:rPr>
+          <w:i/>
+        </w:rPr>
+        <w:t>(Jan. 2023 – Dec. 2023)</w:t>
+      </w:r>
+      <w:r>
+        <w:br/>
+      </w:r>
+      <w:r>
+        <w:t>Conducted business analysis for the Bel/Cinch Website Development project. Wrote Postman tests for stock data analysis, working with GraphQL, .NET, and Postman to ensure robust and reliable API functionality.</w:t>
+      </w:r>
+    </w:p>
+    <w:p>
+      <w:pPr>
+        <w:pStyle w:val="ResumeHeading3"/>
+      </w:pPr>
+      <w:r>
+        <w:rPr>
+          <w:i/>
+        </w:rPr>
+        <w:t>(April 2022 – Jan. 2023)</w:t>
+      </w:r>
+      <w:r>
+        <w:br/>
+      </w:r>
+      <w:r>
+        <w:t>Managed data migrations and automations for Epic Charter School, transitioning from Powerschool to multiple curricula and tools. Developed Edgenuity integrations, automated processes using Node.js and TypeScript, and enhanced a teacher-matching application using .NET and SQL Server. Improved HTTP request concurrency and repository patterns to optimize performance.</w:t>
+      </w:r>
+    </w:p>
+    <w:p>
+      <w:pPr>
+        <w:pStyle w:val="ResumeHeading3"/>
+      </w:pPr>
+      <w:r>
+        <w:rPr>
+          <w:i/>
+        </w:rPr>
+        <w:t>(Aug. 2021 – March 2022)</w:t>
+      </w:r>
+      <w:r>
+        <w:br/>
+      </w:r>
+      <w:r>
+        <w:t>Designed and developed changes to product master data for a major agribusiness firm. Collaborated with Resource Data team members to create a marketing tool for managing product information. Used Boomi for integrations and applied a new product design to the Master Data Hub (MDH). Focused on JSON architecture and technical requirements gathering.</w:t>
+      </w:r>
+    </w:p>
+    <w:p>
+      <w:pPr>
+        <w:pStyle w:val="ResumeHeading3"/>
+      </w:pPr>
+      <w:r>
+        <w:rPr>
+          <w:i/>
+        </w:rPr>
+        <w:t>(May 2021 – June 2021)</w:t>
+      </w:r>
+      <w:r>
+        <w:br/>
+      </w:r>
+      <w:r>
+        <w:t>Implemented application changes for the Washington Department of Natural Resources on its burn portal project. Improved burn permit forms, added data to table views, and modified Esri map pin behavior. Worked with React, Redux, Redux-Saga, Redux-ORM, and .NET to address client requirements efficiently.</w:t>
+      </w:r>
+    </w:p>
+    <w:p>
+      <w:pPr>
+        <w:pStyle w:val="ResumeHeading3"/>
+      </w:pPr>
+      <w:r>
+        <w:rPr>
+          <w:i/>
+        </w:rPr>
+        <w:t>(Jan. 2026 – May 2026)</w:t>
+      </w:r>
+      <w:r>
+        <w:br/>
+      </w:r>
+      <w:r>
+        <w:t>Continued development on the Washington Department of Natural Resources burn portal, upgrading dependencies including React 16 to 18. Refactored reporting from SSRS to .NET LINQ and modernized the UI with functional React components and Redux Toolkit.</w:t>
+      </w:r>
+    </w:p>
+    <w:p>
+      <w:pPr>
+        <w:pStyle w:val="ResumeHeading3"/>
+      </w:pPr>
+      <w:r>
+        <w:t>Delivered application changes for the Alaska Housing Finance Corporation on its planning project, partnering with stakeholders on requirements and full-stack enhancements. Worked with Angular and .NET to address client needs efficiently.</w:t>
+      </w:r>
+    </w:p>
+    <w:p>
+      <w:pPr>
+        <w:pStyle w:val="ResumeHeading3"/>
+      </w:pPr>
       <w:r>
         <w:rPr>
           <w:b/>
-          <w:bCs/>
         </w:rPr>
-        <w:t xml:space="preserve"> Programmer/Analyst</w:t>
+        <w:t>Founder &amp; builder — Critable.com (virtual tabletop)</w:t>
       </w:r>
       <w:r>
         <w:rPr>
           <w:i/>
-          <w:iCs/>
         </w:rPr>
         <w:br/>
-        <w:t>(Jan. 2024 – Sept. 2024)</w:t>
-      </w:r>
-      <w:r>
-        <w:rPr>
-          <w:i/>
-          <w:iCs/>
-        </w:rPr>
+        <w:t>(2025 – Present, alpha)</w:t>
+      </w:r>
+      <w:r>
         <w:br/>
       </w:r>
       <w:r>
-        <w:t xml:space="preserve">Provided </w:t>
-      </w:r>
-      <w:proofErr w:type="spellStart"/>
-      <w:r>
-        <w:t>dotCMS</w:t>
-      </w:r>
-      <w:proofErr w:type="spellEnd"/>
-      <w:r>
-        <w:t xml:space="preserve"> support for CUI Inc. Designed and implemented backend solutions to improve content management functionality and user experience</w:t>
-      </w:r>
-      <w:r>
-        <w:t>.</w:t>
-      </w:r>
-    </w:p>
-    <w:p>
-      <w:pPr>
-        <w:pStyle w:val="BodyText"/>
-      </w:pPr>
-      <w:r>
-        <w:rPr>
-          <w:b/>
-          <w:bCs/>
-        </w:rPr>
-        <w:t>Sr.</w:t>
-      </w:r>
-      <w:r>
-        <w:rPr>
-          <w:b/>
-          <w:bCs/>
-        </w:rPr>
-        <w:t xml:space="preserve"> </w:t>
-      </w:r>
-      <w:r>
-        <w:rPr>
-          <w:b/>
-          <w:bCs/>
-        </w:rPr>
-        <w:t>Programmer/Analyst</w:t>
-      </w:r>
-      <w:r>
-        <w:rPr>
-          <w:i/>
-          <w:iCs/>
-        </w:rPr>
-        <w:br/>
-        <w:t>(Nov. 2023 – Aug. 2024)</w:t>
-      </w:r>
-      <w:r>
-        <w:rPr>
-          <w:i/>
-          <w:iCs/>
-        </w:rPr>
-        <w:br/>
-      </w:r>
-      <w:r>
-        <w:t>Enhanced Career Launch and site improvements for the Washington Student Achievement Council. Collaborated with team members to support ongoing development and maintenance of the website.</w:t>
-      </w:r>
-    </w:p>
-    <w:p>
-      <w:pPr>
-        <w:pStyle w:val="BodyText"/>
-      </w:pPr>
-      <w:r>
-        <w:rPr>
-          <w:b/>
-          <w:bCs/>
-        </w:rPr>
-        <w:t>Sr.</w:t>
-      </w:r>
-      <w:r>
-        <w:rPr>
-          <w:b/>
-          <w:bCs/>
-        </w:rPr>
-        <w:t xml:space="preserve"> </w:t>
-      </w:r>
-      <w:r>
-        <w:rPr>
-          <w:b/>
-          <w:bCs/>
-        </w:rPr>
-        <w:t>Programmer/Analyst</w:t>
-      </w:r>
-      <w:r>
-        <w:rPr>
-          <w:i/>
-          <w:iCs/>
-        </w:rPr>
-        <w:br/>
-        <w:t>(Dec. 2023 – May 2024)</w:t>
-      </w:r>
-      <w:r>
-        <w:rPr>
-          <w:i/>
-          <w:iCs/>
-        </w:rPr>
-        <w:br/>
-      </w:r>
-      <w:r>
-        <w:t xml:space="preserve">Developed custom PDFs for </w:t>
-      </w:r>
-      <w:proofErr w:type="spellStart"/>
-      <w:r>
-        <w:t>IdeaRoom</w:t>
-      </w:r>
-      <w:proofErr w:type="spellEnd"/>
-      <w:r>
-        <w:t xml:space="preserve"> Technologies on its American Steel project. Built components with React, TypeScript, and Storybook to streamline the client’s custom order process.</w:t>
-      </w:r>
-    </w:p>
-    <w:p>
-      <w:pPr>
-        <w:pStyle w:val="BodyText"/>
-      </w:pPr>
-      <w:r>
-        <w:rPr>
-          <w:b/>
-          <w:bCs/>
-        </w:rPr>
-        <w:lastRenderedPageBreak/>
-        <w:t>Programmer/Analyst</w:t>
-      </w:r>
-      <w:r>
-        <w:rPr>
-          <w:i/>
-          <w:iCs/>
-        </w:rPr>
-        <w:br/>
-        <w:t>(Jan. 2023 – Dec. 2023)</w:t>
-      </w:r>
-      <w:r>
-        <w:rPr>
-          <w:i/>
-          <w:iCs/>
-        </w:rPr>
-        <w:br/>
-      </w:r>
-      <w:r>
-        <w:t xml:space="preserve">Conducted business analysis for the Bel/Cinch Website Development project. Wrote Postman tests for stock data analysis, working with </w:t>
-      </w:r>
-      <w:proofErr w:type="spellStart"/>
-      <w:r>
-        <w:t>GraphQL</w:t>
-      </w:r>
-      <w:proofErr w:type="spellEnd"/>
-      <w:r>
-        <w:t>, .NET, and Postman to ensure robust and reliable API functionality.</w:t>
-      </w:r>
-    </w:p>
-    <w:p>
-      <w:pPr>
-        <w:pStyle w:val="BodyText"/>
-        <w:rPr>
-          <w:i/>
-          <w:iCs/>
-        </w:rPr>
-      </w:pPr>
-      <w:r>
-        <w:rPr>
-          <w:b/>
-          <w:bCs/>
-        </w:rPr>
-        <w:t>Programmer/Analyst</w:t>
-      </w:r>
-      <w:r>
-        <w:rPr>
-          <w:i/>
-          <w:iCs/>
-        </w:rPr>
-        <w:br/>
-        <w:t>(April 2022 – Jan. 2023)</w:t>
-      </w:r>
-      <w:r>
-        <w:rPr>
-          <w:i/>
-          <w:iCs/>
-        </w:rPr>
-        <w:br/>
-      </w:r>
-      <w:r>
-        <w:t xml:space="preserve">Managed data migrations and automations for Epic Charter School, transitioning from </w:t>
-      </w:r>
-      <w:proofErr w:type="spellStart"/>
-      <w:r>
-        <w:t>Powerschool</w:t>
-      </w:r>
-      <w:proofErr w:type="spellEnd"/>
-      <w:r>
-        <w:t xml:space="preserve"> to multiple curricula and tools. Developed </w:t>
-      </w:r>
-      <w:proofErr w:type="spellStart"/>
-      <w:r>
-        <w:t>Edgenuity</w:t>
-      </w:r>
-      <w:proofErr w:type="spellEnd"/>
-      <w:r>
-        <w:t xml:space="preserve"> integrations, automated processes using Node.js and TypeScript, and enhanced a teacher-matching application using .NET and SQL Server. Improved HTTP request concurrency and repository patterns to optimize performance.</w:t>
-      </w:r>
-    </w:p>
-    <w:p>
-      <w:pPr>
-        <w:pStyle w:val="BodyText"/>
-      </w:pPr>
-      <w:r>
-        <w:rPr>
-          <w:b/>
-          <w:bCs/>
-        </w:rPr>
-        <w:t>Programmer/Analyst</w:t>
-      </w:r>
-      <w:r>
-        <w:rPr>
-          <w:i/>
-          <w:iCs/>
-        </w:rPr>
-        <w:br/>
-        <w:t>(Aug. 2021 – March 2022)</w:t>
-      </w:r>
-      <w:r>
-        <w:rPr>
-          <w:i/>
-          <w:iCs/>
-        </w:rPr>
-        <w:br/>
-      </w:r>
-      <w:r>
-        <w:t>Designed and developed changes to product master data for a major agribusiness firm. Collaborated with Resource Data team members to create a marketing tool for managing product information. Used Boomi for integrations and applied a new product design to the Master Data Hub (MDH). Focused on JSON architecture and technical requirements gathering.</w:t>
-      </w:r>
-    </w:p>
-    <w:p>
-      <w:pPr>
-        <w:pStyle w:val="BodyText"/>
-      </w:pPr>
-      <w:r>
-        <w:rPr>
-          <w:b/>
-          <w:bCs/>
-        </w:rPr>
-        <w:t>Programmer/Analyst</w:t>
-      </w:r>
-      <w:r>
-        <w:rPr>
-          <w:i/>
-          <w:iCs/>
-        </w:rPr>
-        <w:br/>
-        <w:t>(May 2021 – June 2021)</w:t>
-      </w:r>
-      <w:r>
-        <w:rPr>
-          <w:i/>
-          <w:iCs/>
-        </w:rPr>
-        <w:br/>
-      </w:r>
-      <w:r>
-        <w:t xml:space="preserve">Implemented application changes for the Washington Department of Natural Resources on its </w:t>
-      </w:r>
-      <w:r>
-        <w:t xml:space="preserve">burn portal </w:t>
-      </w:r>
-      <w:r>
-        <w:t xml:space="preserve">project. Improved </w:t>
-      </w:r>
-      <w:r>
-        <w:t xml:space="preserve">burn permit </w:t>
-      </w:r>
-      <w:r>
-        <w:t>forms</w:t>
-      </w:r>
-      <w:r>
-        <w:t>,</w:t>
-      </w:r>
-      <w:r>
-        <w:t xml:space="preserve"> added data to table views, and modified E</w:t>
-      </w:r>
-      <w:r>
-        <w:t xml:space="preserve">sri </w:t>
-      </w:r>
-      <w:r>
-        <w:t>map pin behavior. Worked with React, Redux, Redux-Saga, Redux-ORM, and .NET to address client requirements efficiently.</w:t>
+        <w:t>Built a web-based virtual tabletop platform with Next.js and Supabase, running a closed alpha test with about 20 users while iterating from feedback.</w:t>
       </w:r>
     </w:p>
     <w:p>
@@ -432,9 +278,33 @@
       <w:r>
         <w:rPr>
           <w:b/>
+        </w:rPr>
+        <w:t>Early-stage startup (NimblePath) — Prototype development</w:t>
+      </w:r>
+      <w:r>
+        <w:rPr>
+          <w:i/>
+        </w:rPr>
+        <w:br/>
+        <w:t>(2021 – 2023, intermittent)</w:t>
+      </w:r>
+      <w:r>
+        <w:br/>
+      </w:r>
+      <w:r>
+        <w:t>Built React/Redux UI prototypes from wireframes for a founder-led SaaS concept. Implemented a Java Spring API and Heroku demo environments for stakeholder review. Work paused before public launch when the venture did not move forward.</w:t>
+      </w:r>
+    </w:p>
+    <w:p>
+      <w:pPr>
+        <w:pStyle w:val="BodyText"/>
+      </w:pPr>
+      <w:r>
+        <w:rPr>
+          <w:b/>
           <w:bCs/>
         </w:rPr>
-        <w:t>Freelance Developer</w:t>
+        <w:t>Team Lead</w:t>
       </w:r>
       <w:r>
         <w:rPr>
@@ -448,39 +318,21 @@
           <w:i/>
           <w:iCs/>
         </w:rPr>
-        <w:t>(2021 – 2023)</w:t>
+        <w:t>(2020</w:t>
       </w:r>
       <w:r>
         <w:rPr>
-          <w:b/>
-          <w:bCs/>
           <w:i/>
           <w:iCs/>
         </w:rPr>
-        <w:br/>
-      </w:r>
-      <w:r>
-        <w:t xml:space="preserve">Developed SaaS solutions for </w:t>
-      </w:r>
-      <w:proofErr w:type="spellStart"/>
-      <w:r>
-        <w:t>NimblePath</w:t>
-      </w:r>
-      <w:proofErr w:type="spellEnd"/>
-      <w:r>
-        <w:t>. Designed front-end wireframes and implemented them using React and Redux to align with the client’s vision. Built a backend API framework using Java Spring, deployed through Heroku, ensuring seamless integration and scalability.</w:t>
-      </w:r>
-    </w:p>
-    <w:p>
-      <w:pPr>
-        <w:pStyle w:val="BodyText"/>
-      </w:pPr>
+        <w:t xml:space="preserve"> – 2021</w:t>
+      </w:r>
       <w:r>
         <w:rPr>
-          <w:b/>
-          <w:bCs/>
+          <w:i/>
+          <w:iCs/>
         </w:rPr>
-        <w:t>Team Lead</w:t>
+        <w:t>)</w:t>
       </w:r>
       <w:r>
         <w:rPr>
@@ -490,35 +342,26 @@
         <w:br/>
       </w:r>
       <w:r>
-        <w:rPr>
-          <w:i/>
-          <w:iCs/>
-        </w:rPr>
-        <w:t>(2020</w:t>
-      </w:r>
-      <w:r>
-        <w:rPr>
-          <w:i/>
-          <w:iCs/>
-        </w:rPr>
-        <w:t xml:space="preserve"> – 2021</w:t>
-      </w:r>
-      <w:r>
-        <w:rPr>
-          <w:i/>
-          <w:iCs/>
-        </w:rPr>
-        <w:t>)</w:t>
-      </w:r>
+        <w:t>Provided mentorship and technical guidance at Lambda School. Delivered weekly 1:1 code feedback sessions for 10 students, helping them effectively learn and solve programming challenges. Led daily standup meetings to offer additional instruction and clarify weekly study material, fostering a supportive learning environment.</w:t>
+      </w:r>
+    </w:p>
+    <w:p>
+      <w:pPr>
+        <w:pStyle w:val="BodyText"/>
+      </w:pPr>
       <w:r>
         <w:rPr>
           <w:b/>
-          <w:bCs/>
         </w:rPr>
-        <w:br/>
-      </w:r>
-      <w:r>
-        <w:t>Provided mentorship and technical guidance at Lambda School. Delivered weekly 1:1 code feedback sessions for 10 students, helping them effectively learn and solve programming challenges. Led daily standup meetings to offer additional instruction and clarify weekly study material, fostering a supportive learning environment.</w:t>
+        <w:t>Earlier experience</w:t>
+      </w:r>
+    </w:p>
+    <w:p>
+      <w:pPr>
+        <w:pStyle w:val="BodyText"/>
+      </w:pPr>
+      <w:r>
+        <w:t>Customer-facing technical roles (2016–2020): phone support and field troubleshooting.</w:t>
       </w:r>
     </w:p>
     <w:p>
@@ -529,109 +372,6 @@
           <w:bCs/>
         </w:rPr>
       </w:pPr>
-    </w:p>
-    <w:p>
-      <w:pPr>
-        <w:pStyle w:val="BodyText"/>
-        <w:rPr>
-          <w:b/>
-          <w:bCs/>
-        </w:rPr>
-      </w:pPr>
-      <w:r>
-        <w:rPr>
-          <w:b/>
-          <w:bCs/>
-        </w:rPr>
-        <w:lastRenderedPageBreak/>
-        <w:t>Cable Technician</w:t>
-      </w:r>
-      <w:r>
-        <w:rPr>
-          <w:b/>
-          <w:bCs/>
-        </w:rPr>
-        <w:br/>
-      </w:r>
-      <w:r>
-        <w:rPr>
-          <w:i/>
-          <w:iCs/>
-        </w:rPr>
-        <w:t>(2019</w:t>
-      </w:r>
-      <w:r>
-        <w:rPr>
-          <w:i/>
-          <w:iCs/>
-        </w:rPr>
-        <w:t xml:space="preserve"> – 2020</w:t>
-      </w:r>
-      <w:r>
-        <w:rPr>
-          <w:i/>
-          <w:iCs/>
-        </w:rPr>
-        <w:t>)</w:t>
-      </w:r>
-      <w:r>
-        <w:rPr>
-          <w:b/>
-          <w:bCs/>
-        </w:rPr>
-        <w:br/>
-      </w:r>
-      <w:r>
-        <w:t>Installed residential cable and internet services for Spectra Broadband in Portland, OR. Diagnosed and resolved technical issues with equipment and services, ensuring customer satisfaction. Achieved a 9/10 satisfaction rating by consistently delivering high-quality service.</w:t>
-      </w:r>
-    </w:p>
-    <w:p>
-      <w:pPr>
-        <w:pStyle w:val="BodyText"/>
-        <w:rPr>
-          <w:b/>
-          <w:bCs/>
-        </w:rPr>
-      </w:pPr>
-      <w:r>
-        <w:rPr>
-          <w:b/>
-          <w:bCs/>
-        </w:rPr>
-        <w:t>Customer Support Representative</w:t>
-      </w:r>
-      <w:r>
-        <w:rPr>
-          <w:b/>
-          <w:bCs/>
-        </w:rPr>
-        <w:br/>
-      </w:r>
-      <w:r>
-        <w:rPr>
-          <w:i/>
-          <w:iCs/>
-        </w:rPr>
-        <w:t>(2016</w:t>
-      </w:r>
-      <w:r>
-        <w:rPr>
-          <w:i/>
-          <w:iCs/>
-        </w:rPr>
-        <w:t xml:space="preserve"> – 2019</w:t>
-      </w:r>
-      <w:r>
-        <w:rPr>
-          <w:i/>
-          <w:iCs/>
-        </w:rPr>
-        <w:t>)</w:t>
-      </w:r>
-      <w:r>
-        <w:br/>
-        <w:t>Provided technical support for Verizon phones at Xerox, resolving customer issues efficiently and accurately. Consistently met and exceeded quality assurance goals, achieving a weekly rating of 4/5 or higher.</w:t>
-      </w:r>
     </w:p>
     <w:p>
       <w:pPr>

</xml_diff>